<commit_message>
Correcciones en un indicador, informe y README
</commit_message>
<xml_diff>
--- a/informe.docx
+++ b/informe.docx
@@ -298,7 +298,6 @@
           <w:lang w:val="es-GT"/>
         </w:rPr>
       </w:pPr>
-      <w:proofErr w:type="spellStart"/>
       <w:r>
         <w:rPr>
           <w:rFonts w:ascii="Times New Roman" w:eastAsia="Times New Roman" w:hAnsi="Times New Roman" w:cs="Times New Roman"/>
@@ -307,9 +306,8 @@
           <w:szCs w:val="24"/>
           <w:lang w:val="es-GT"/>
         </w:rPr>
-        <w:t>Jose</w:t>
-      </w:r>
-      <w:proofErr w:type="spellEnd"/>
+        <w:t>Jos</w:t>
+      </w:r>
       <w:r>
         <w:rPr>
           <w:rFonts w:ascii="Times New Roman" w:eastAsia="Times New Roman" w:hAnsi="Times New Roman" w:cs="Times New Roman"/>
@@ -318,9 +316,8 @@
           <w:szCs w:val="24"/>
           <w:lang w:val="es-GT"/>
         </w:rPr>
-        <w:t xml:space="preserve"> Manuel </w:t>
-      </w:r>
-      <w:proofErr w:type="spellStart"/>
+        <w:t>é</w:t>
+      </w:r>
       <w:r>
         <w:rPr>
           <w:rFonts w:ascii="Times New Roman" w:eastAsia="Times New Roman" w:hAnsi="Times New Roman" w:cs="Times New Roman"/>
@@ -329,9 +326,8 @@
           <w:szCs w:val="24"/>
           <w:lang w:val="es-GT"/>
         </w:rPr>
-        <w:t>Sanchez</w:t>
-      </w:r>
-      <w:proofErr w:type="spellEnd"/>
+        <w:t xml:space="preserve"> Manuel Sanchez – </w:t>
+      </w:r>
       <w:r>
         <w:rPr>
           <w:rFonts w:ascii="Times New Roman" w:eastAsia="Times New Roman" w:hAnsi="Times New Roman" w:cs="Times New Roman"/>
@@ -340,7 +336,7 @@
           <w:szCs w:val="24"/>
           <w:lang w:val="es-GT"/>
         </w:rPr>
-        <w:t xml:space="preserve"> – </w:t>
+        <w:t>24092</w:t>
       </w:r>
     </w:p>
     <w:p>
@@ -523,9 +519,8 @@
           <w:lang w:val="es-GT"/>
         </w:rPr>
         <w:lastRenderedPageBreak/>
-        <w:t xml:space="preserve">Lab 7 — Visualización de Datos · </w:t>
-      </w:r>
-      <w:proofErr w:type="spellStart"/>
+        <w:t>Lab 7 — Visualización de Datos</w:t>
+      </w:r>
       <w:r>
         <w:rPr>
           <w:rFonts w:ascii="Times New Roman" w:hAnsi="Times New Roman" w:cs="Times New Roman"/>
@@ -533,6 +528,25 @@
           <w:szCs w:val="28"/>
           <w:lang w:val="es-GT"/>
         </w:rPr>
+        <w:t>:</w:t>
+      </w:r>
+      <w:r>
+        <w:rPr>
+          <w:rFonts w:ascii="Times New Roman" w:hAnsi="Times New Roman" w:cs="Times New Roman"/>
+          <w:sz w:val="28"/>
+          <w:szCs w:val="28"/>
+          <w:lang w:val="es-GT"/>
+        </w:rPr>
+        <w:t xml:space="preserve"> </w:t>
+      </w:r>
+      <w:proofErr w:type="spellStart"/>
+      <w:r>
+        <w:rPr>
+          <w:rFonts w:ascii="Times New Roman" w:hAnsi="Times New Roman" w:cs="Times New Roman"/>
+          <w:sz w:val="28"/>
+          <w:szCs w:val="28"/>
+          <w:lang w:val="es-GT"/>
+        </w:rPr>
         <w:t>RetailMax</w:t>
       </w:r>
       <w:proofErr w:type="spellEnd"/>
@@ -540,14 +554,6 @@
     <w:p>
       <w:pPr>
         <w:spacing w:after="120"/>
-        <w:rPr>
-          <w:rFonts w:ascii="Times New Roman" w:hAnsi="Times New Roman" w:cs="Times New Roman"/>
-          <w:sz w:val="24"/>
-          <w:szCs w:val="24"/>
-          <w:lang w:val="es-GT"/>
-        </w:rPr>
-      </w:pPr>
-      <w:r>
         <w:rPr>
           <w:rFonts w:ascii="Times New Roman" w:hAnsi="Times New Roman" w:cs="Times New Roman"/>
           <w:b/>
@@ -556,7 +562,50 @@
           <w:szCs w:val="24"/>
           <w:lang w:val="es-GT"/>
         </w:rPr>
-        <w:t xml:space="preserve">Área de negocio: </w:t>
+      </w:pPr>
+    </w:p>
+    <w:p>
+      <w:pPr>
+        <w:spacing w:after="120"/>
+        <w:rPr>
+          <w:rFonts w:ascii="Times New Roman" w:hAnsi="Times New Roman" w:cs="Times New Roman"/>
+          <w:sz w:val="24"/>
+          <w:szCs w:val="24"/>
+          <w:lang w:val="es-GT"/>
+        </w:rPr>
+      </w:pPr>
+      <w:r>
+        <w:rPr>
+          <w:rFonts w:ascii="Times New Roman" w:hAnsi="Times New Roman" w:cs="Times New Roman"/>
+          <w:b/>
+          <w:bCs/>
+          <w:sz w:val="24"/>
+          <w:szCs w:val="24"/>
+          <w:lang w:val="es-GT"/>
+        </w:rPr>
+        <w:t>Área de negocio</w:t>
+      </w:r>
+      <w:r>
+        <w:rPr>
+          <w:rFonts w:ascii="Times New Roman" w:hAnsi="Times New Roman" w:cs="Times New Roman"/>
+          <w:b/>
+          <w:bCs/>
+          <w:sz w:val="24"/>
+          <w:szCs w:val="24"/>
+          <w:lang w:val="es-GT"/>
+        </w:rPr>
+        <w:t xml:space="preserve"> 1</w:t>
+      </w:r>
+      <w:r>
+        <w:rPr>
+          <w:rFonts w:ascii="Times New Roman" w:hAnsi="Times New Roman" w:cs="Times New Roman"/>
+          <w:b/>
+          <w:bCs/>
+          <w:sz w:val="24"/>
+          <w:szCs w:val="24"/>
+          <w:lang w:val="es-GT"/>
+        </w:rPr>
+        <w:t xml:space="preserve">: </w:t>
       </w:r>
       <w:r>
         <w:rPr>
@@ -873,6 +922,13 @@
           </wp:inline>
         </w:drawing>
       </w:r>
+      <w:r>
+        <w:rPr>
+          <w:rFonts w:ascii="Times New Roman" w:hAnsi="Times New Roman" w:cs="Times New Roman"/>
+          <w:lang w:val="es-GT"/>
+        </w:rPr>
+        <w:br w:type="page"/>
+      </w:r>
     </w:p>
     <w:p>
       <w:pPr>
@@ -887,23 +943,6 @@
           <w:rFonts w:ascii="Times New Roman" w:hAnsi="Times New Roman" w:cs="Times New Roman"/>
           <w:lang w:val="es-GT"/>
         </w:rPr>
-        <w:br w:type="page"/>
-      </w:r>
-    </w:p>
-    <w:p>
-      <w:pPr>
-        <w:pStyle w:val="Ttulo3"/>
-        <w:rPr>
-          <w:rFonts w:ascii="Times New Roman" w:hAnsi="Times New Roman" w:cs="Times New Roman"/>
-          <w:lang w:val="es-GT"/>
-        </w:rPr>
-      </w:pPr>
-      <w:r>
-        <w:rPr>
-          <w:rFonts w:ascii="Times New Roman" w:hAnsi="Times New Roman" w:cs="Times New Roman"/>
-          <w:lang w:val="es-GT"/>
-        </w:rPr>
-        <w:lastRenderedPageBreak/>
         <w:t>KPI 2 — Ventas por Mes</w:t>
       </w:r>
     </w:p>
@@ -1219,7 +1258,6 @@
           <w:rFonts w:ascii="Times New Roman" w:hAnsi="Times New Roman" w:cs="Times New Roman"/>
           <w:lang w:val="es-GT"/>
         </w:rPr>
-        <w:lastRenderedPageBreak/>
         <w:t>KPI 3 — Top 10 Productos Más Vendidos</w:t>
       </w:r>
     </w:p>
@@ -1484,40 +1522,7 @@
           <w:rFonts w:ascii="Times New Roman" w:hAnsi="Times New Roman" w:cs="Times New Roman"/>
           <w:lang w:val="es-GT"/>
         </w:rPr>
-        <w:lastRenderedPageBreak/>
-        <w:t xml:space="preserve">KPI 4 — Valor </w:t>
-      </w:r>
-      <w:proofErr w:type="spellStart"/>
-      <w:r>
-        <w:rPr>
-          <w:rFonts w:ascii="Times New Roman" w:hAnsi="Times New Roman" w:cs="Times New Roman"/>
-          <w:lang w:val="es-GT"/>
-        </w:rPr>
-        <w:t>Promedio</w:t>
-      </w:r>
-      <w:proofErr w:type="spellEnd"/>
-      <w:r>
-        <w:rPr>
-          <w:rFonts w:ascii="Times New Roman" w:hAnsi="Times New Roman" w:cs="Times New Roman"/>
-          <w:lang w:val="es-GT"/>
-        </w:rPr>
-        <w:t xml:space="preserve"> </w:t>
-      </w:r>
-      <w:proofErr w:type="spellStart"/>
-      <w:r>
-        <w:rPr>
-          <w:rFonts w:ascii="Times New Roman" w:hAnsi="Times New Roman" w:cs="Times New Roman"/>
-          <w:lang w:val="es-GT"/>
-        </w:rPr>
-        <w:t>por</w:t>
-      </w:r>
-      <w:proofErr w:type="spellEnd"/>
-      <w:r>
-        <w:rPr>
-          <w:rFonts w:ascii="Times New Roman" w:hAnsi="Times New Roman" w:cs="Times New Roman"/>
-          <w:lang w:val="es-GT"/>
-        </w:rPr>
-        <w:t xml:space="preserve"> Venta</w:t>
+        <w:t>KPI 4 — Valor Promedio por Venta</w:t>
       </w:r>
     </w:p>
     <w:p>
@@ -1648,6 +1653,7 @@
       <w:r>
         <w:rPr>
           <w:rFonts w:ascii="Times New Roman" w:hAnsi="Times New Roman" w:cs="Times New Roman"/>
+          <w:noProof/>
           <w:sz w:val="24"/>
           <w:szCs w:val="24"/>
           <w:lang w:val="es-GT"/>
@@ -1727,10 +1733,10 @@
           <w:lang w:val="es-GT"/>
         </w:rPr>
         <w:drawing>
-          <wp:inline distT="0" distB="0" distL="0" distR="0" wp14:anchorId="537AC0B8" wp14:editId="3EBFE110">
-            <wp:extent cx="5943600" cy="1541145"/>
-            <wp:effectExtent l="0" t="0" r="0" b="1905"/>
-            <wp:docPr id="1576264737" name="Imagen 1"/>
+          <wp:inline distT="0" distB="0" distL="0" distR="0" wp14:anchorId="632DD99C" wp14:editId="0443B09B">
+            <wp:extent cx="5875020" cy="1898711"/>
+            <wp:effectExtent l="0" t="0" r="0" b="6350"/>
+            <wp:docPr id="965005360" name="Imagen 1"/>
             <wp:cNvGraphicFramePr>
               <a:graphicFrameLocks xmlns:a="http://schemas.openxmlformats.org/drawingml/2006/main" noChangeAspect="1"/>
             </wp:cNvGraphicFramePr>
@@ -1738,7 +1744,7 @@
               <a:graphicData uri="http://schemas.openxmlformats.org/drawingml/2006/picture">
                 <pic:pic xmlns:pic="http://schemas.openxmlformats.org/drawingml/2006/picture">
                   <pic:nvPicPr>
-                    <pic:cNvPr id="1576264737" name=""/>
+                    <pic:cNvPr id="965005360" name=""/>
                     <pic:cNvPicPr/>
                   </pic:nvPicPr>
                   <pic:blipFill>
@@ -1750,7 +1756,7 @@
                   <pic:spPr>
                     <a:xfrm>
                       <a:off x="0" y="0"/>
-                      <a:ext cx="5943600" cy="1541145"/>
+                      <a:ext cx="5886194" cy="1902322"/>
                     </a:xfrm>
                     <a:prstGeom prst="rect">
                       <a:avLst/>
@@ -1768,6 +1774,17 @@
         <w:spacing w:after="120"/>
         <w:rPr>
           <w:rFonts w:ascii="Times New Roman" w:hAnsi="Times New Roman" w:cs="Times New Roman"/>
+          <w:sz w:val="24"/>
+          <w:szCs w:val="24"/>
+          <w:lang w:val="es-GT"/>
+        </w:rPr>
+      </w:pPr>
+    </w:p>
+    <w:p>
+      <w:pPr>
+        <w:spacing w:after="120"/>
+        <w:rPr>
+          <w:rFonts w:ascii="Times New Roman" w:hAnsi="Times New Roman" w:cs="Times New Roman"/>
           <w:b/>
           <w:bCs/>
           <w:sz w:val="24"/>
@@ -1775,7 +1792,10 @@
           <w:lang w:val="es-GT"/>
         </w:rPr>
       </w:pPr>
-      <w:r>
+    </w:p>
+    <w:p>
+      <w:pPr>
+        <w:spacing w:after="120"/>
         <w:rPr>
           <w:rFonts w:ascii="Times New Roman" w:hAnsi="Times New Roman" w:cs="Times New Roman"/>
           <w:b/>
@@ -1784,20 +1804,11 @@
           <w:szCs w:val="24"/>
           <w:lang w:val="es-GT"/>
         </w:rPr>
-        <w:t>KPI 5 — Volumen de Pedidos Mensual</w:t>
-      </w:r>
-    </w:p>
-    <w:p>
-      <w:pPr>
-        <w:spacing w:after="120"/>
-        <w:rPr>
-          <w:rFonts w:ascii="Times New Roman" w:hAnsi="Times New Roman" w:cs="Times New Roman"/>
-          <w:sz w:val="24"/>
-          <w:szCs w:val="24"/>
-          <w:lang w:val="es-GT"/>
-        </w:rPr>
-      </w:pPr>
-      <w:r>
+      </w:pPr>
+    </w:p>
+    <w:p>
+      <w:pPr>
+        <w:spacing w:after="120"/>
         <w:rPr>
           <w:rFonts w:ascii="Times New Roman" w:hAnsi="Times New Roman" w:cs="Times New Roman"/>
           <w:b/>
@@ -1806,29 +1817,11 @@
           <w:szCs w:val="24"/>
           <w:lang w:val="es-GT"/>
         </w:rPr>
-        <w:t>Qué representa:</w:t>
-      </w:r>
-      <w:r>
-        <w:rPr>
-          <w:rFonts w:ascii="Times New Roman" w:hAnsi="Times New Roman" w:cs="Times New Roman"/>
-          <w:sz w:val="24"/>
-          <w:szCs w:val="24"/>
-          <w:lang w:val="es-GT"/>
-        </w:rPr>
-        <w:t xml:space="preserve"> Cantidad de pedidos completados por cada mes. A diferencia del indicador de ventas por mes, este KPI no mide ingresos, sino el número de transacciones realizadas.</w:t>
-      </w:r>
-    </w:p>
-    <w:p>
-      <w:pPr>
-        <w:spacing w:after="120"/>
-        <w:rPr>
-          <w:rFonts w:ascii="Times New Roman" w:hAnsi="Times New Roman" w:cs="Times New Roman"/>
-          <w:sz w:val="24"/>
-          <w:szCs w:val="24"/>
-          <w:lang w:val="es-GT"/>
-        </w:rPr>
-      </w:pPr>
-      <w:r>
+      </w:pPr>
+    </w:p>
+    <w:p>
+      <w:pPr>
+        <w:spacing w:after="120"/>
         <w:rPr>
           <w:rFonts w:ascii="Times New Roman" w:hAnsi="Times New Roman" w:cs="Times New Roman"/>
           <w:b/>
@@ -1837,27 +1830,6 @@
           <w:szCs w:val="24"/>
           <w:lang w:val="es-GT"/>
         </w:rPr>
-        <w:t>Importancia para el área:</w:t>
-      </w:r>
-      <w:r>
-        <w:rPr>
-          <w:rFonts w:ascii="Times New Roman" w:hAnsi="Times New Roman" w:cs="Times New Roman"/>
-          <w:sz w:val="24"/>
-          <w:szCs w:val="24"/>
-          <w:lang w:val="es-GT"/>
-        </w:rPr>
-        <w:t xml:space="preserve"> Permite analizar si el movimiento comercial aumenta o disminuye a lo largo del tiempo. También ayuda a interpretar si los ingresos crecen porque hay más pedidos o porque cada venta tiene un valor promedio más alto.</w:t>
-      </w:r>
-    </w:p>
-    <w:p>
-      <w:pPr>
-        <w:spacing w:after="120"/>
-        <w:rPr>
-          <w:rFonts w:ascii="Times New Roman" w:hAnsi="Times New Roman" w:cs="Times New Roman"/>
-          <w:sz w:val="24"/>
-          <w:szCs w:val="24"/>
-          <w:lang w:val="es-GT"/>
-        </w:rPr>
       </w:pPr>
       <w:r>
         <w:rPr>
@@ -1868,7 +1840,90 @@
           <w:szCs w:val="24"/>
           <w:lang w:val="es-GT"/>
         </w:rPr>
-        <w:lastRenderedPageBreak/>
+        <w:t>KPI 5 — Volumen de Pedidos Mensual</w:t>
+      </w:r>
+    </w:p>
+    <w:p>
+      <w:pPr>
+        <w:spacing w:after="120"/>
+        <w:rPr>
+          <w:rFonts w:ascii="Times New Roman" w:hAnsi="Times New Roman" w:cs="Times New Roman"/>
+          <w:sz w:val="24"/>
+          <w:szCs w:val="24"/>
+          <w:lang w:val="es-GT"/>
+        </w:rPr>
+      </w:pPr>
+      <w:r>
+        <w:rPr>
+          <w:rFonts w:ascii="Times New Roman" w:hAnsi="Times New Roman" w:cs="Times New Roman"/>
+          <w:b/>
+          <w:bCs/>
+          <w:sz w:val="24"/>
+          <w:szCs w:val="24"/>
+          <w:lang w:val="es-GT"/>
+        </w:rPr>
+        <w:t>Qué representa:</w:t>
+      </w:r>
+      <w:r>
+        <w:rPr>
+          <w:rFonts w:ascii="Times New Roman" w:hAnsi="Times New Roman" w:cs="Times New Roman"/>
+          <w:sz w:val="24"/>
+          <w:szCs w:val="24"/>
+          <w:lang w:val="es-GT"/>
+        </w:rPr>
+        <w:t xml:space="preserve"> Cantidad de pedidos completados por cada mes. A diferencia del indicador de ventas por mes, este KPI no mide ingresos, sino el número de transacciones realizadas.</w:t>
+      </w:r>
+    </w:p>
+    <w:p>
+      <w:pPr>
+        <w:spacing w:after="120"/>
+        <w:rPr>
+          <w:rFonts w:ascii="Times New Roman" w:hAnsi="Times New Roman" w:cs="Times New Roman"/>
+          <w:sz w:val="24"/>
+          <w:szCs w:val="24"/>
+          <w:lang w:val="es-GT"/>
+        </w:rPr>
+      </w:pPr>
+      <w:r>
+        <w:rPr>
+          <w:rFonts w:ascii="Times New Roman" w:hAnsi="Times New Roman" w:cs="Times New Roman"/>
+          <w:b/>
+          <w:bCs/>
+          <w:sz w:val="24"/>
+          <w:szCs w:val="24"/>
+          <w:lang w:val="es-GT"/>
+        </w:rPr>
+        <w:t>Importancia para el área:</w:t>
+      </w:r>
+      <w:r>
+        <w:rPr>
+          <w:rFonts w:ascii="Times New Roman" w:hAnsi="Times New Roman" w:cs="Times New Roman"/>
+          <w:sz w:val="24"/>
+          <w:szCs w:val="24"/>
+          <w:lang w:val="es-GT"/>
+        </w:rPr>
+        <w:t xml:space="preserve"> Permite analizar si el movimiento comercial aumenta o disminuye a lo largo del tiempo. También ayuda a interpretar si los ingresos crecen porque hay más pedidos o porque cada venta tiene un valor promedio más alto.</w:t>
+      </w:r>
+    </w:p>
+    <w:p>
+      <w:pPr>
+        <w:spacing w:after="120"/>
+        <w:rPr>
+          <w:rFonts w:ascii="Times New Roman" w:hAnsi="Times New Roman" w:cs="Times New Roman"/>
+          <w:sz w:val="24"/>
+          <w:szCs w:val="24"/>
+          <w:lang w:val="es-GT"/>
+        </w:rPr>
+      </w:pPr>
+      <w:r>
+        <w:rPr>
+          <w:rFonts w:ascii="Times New Roman" w:hAnsi="Times New Roman" w:cs="Times New Roman"/>
+          <w:b/>
+          <w:bCs/>
+          <w:sz w:val="24"/>
+          <w:szCs w:val="24"/>
+          <w:lang w:val="es-GT"/>
+        </w:rPr>
         <w:t>Visualización:</w:t>
       </w:r>
       <w:r>
@@ -1894,6 +1949,7 @@
       <w:r>
         <w:rPr>
           <w:rFonts w:ascii="Times New Roman" w:hAnsi="Times New Roman" w:cs="Times New Roman"/>
+          <w:noProof/>
           <w:sz w:val="24"/>
           <w:szCs w:val="24"/>
           <w:lang w:val="es-GT"/>
@@ -1958,6 +2014,7 @@
     <w:p>
       <w:pPr>
         <w:spacing w:after="120"/>
+        <w:jc w:val="center"/>
         <w:rPr>
           <w:rFonts w:ascii="Times New Roman" w:hAnsi="Times New Roman" w:cs="Times New Roman"/>
           <w:sz w:val="24"/>
@@ -1973,10 +2030,10 @@
           <w:lang w:val="es-GT"/>
         </w:rPr>
         <w:drawing>
-          <wp:inline distT="0" distB="0" distL="0" distR="0" wp14:anchorId="4E30AABA" wp14:editId="33F74869">
-            <wp:extent cx="5945753" cy="1912620"/>
-            <wp:effectExtent l="0" t="0" r="0" b="0"/>
-            <wp:docPr id="367963740" name="Imagen 1"/>
+          <wp:inline distT="0" distB="0" distL="0" distR="0" wp14:anchorId="0FDE7C98" wp14:editId="466D60C7">
+            <wp:extent cx="4390878" cy="1729740"/>
+            <wp:effectExtent l="0" t="0" r="0" b="3810"/>
+            <wp:docPr id="1281297931" name="Imagen 1"/>
             <wp:cNvGraphicFramePr>
               <a:graphicFrameLocks xmlns:a="http://schemas.openxmlformats.org/drawingml/2006/main" noChangeAspect="1"/>
             </wp:cNvGraphicFramePr>
@@ -1984,7 +2041,7 @@
               <a:graphicData uri="http://schemas.openxmlformats.org/drawingml/2006/picture">
                 <pic:pic xmlns:pic="http://schemas.openxmlformats.org/drawingml/2006/picture">
                   <pic:nvPicPr>
-                    <pic:cNvPr id="367963740" name=""/>
+                    <pic:cNvPr id="1281297931" name=""/>
                     <pic:cNvPicPr/>
                   </pic:nvPicPr>
                   <pic:blipFill>
@@ -1996,7 +2053,7 @@
                   <pic:spPr>
                     <a:xfrm>
                       <a:off x="0" y="0"/>
-                      <a:ext cx="5951134" cy="1914351"/>
+                      <a:ext cx="4393546" cy="1730791"/>
                     </a:xfrm>
                     <a:prstGeom prst="rect">
                       <a:avLst/>
@@ -2021,7 +2078,10 @@
           <w:lang w:val="es-GT"/>
         </w:rPr>
       </w:pPr>
-      <w:r>
+    </w:p>
+    <w:p>
+      <w:pPr>
+        <w:spacing w:after="120"/>
         <w:rPr>
           <w:rFonts w:ascii="Times New Roman" w:hAnsi="Times New Roman" w:cs="Times New Roman"/>
           <w:b/>
@@ -2030,20 +2090,11 @@
           <w:szCs w:val="24"/>
           <w:lang w:val="es-GT"/>
         </w:rPr>
-        <w:t>KPI 6 — Ventas por Categoría de Producto</w:t>
-      </w:r>
-    </w:p>
-    <w:p>
-      <w:pPr>
-        <w:spacing w:after="120"/>
-        <w:rPr>
-          <w:rFonts w:ascii="Times New Roman" w:hAnsi="Times New Roman" w:cs="Times New Roman"/>
-          <w:sz w:val="24"/>
-          <w:szCs w:val="24"/>
-          <w:lang w:val="es-GT"/>
-        </w:rPr>
-      </w:pPr>
-      <w:r>
+      </w:pPr>
+    </w:p>
+    <w:p>
+      <w:pPr>
+        <w:spacing w:after="120"/>
         <w:rPr>
           <w:rFonts w:ascii="Times New Roman" w:hAnsi="Times New Roman" w:cs="Times New Roman"/>
           <w:b/>
@@ -2052,29 +2103,11 @@
           <w:szCs w:val="24"/>
           <w:lang w:val="es-GT"/>
         </w:rPr>
-        <w:t>Qué representa:</w:t>
-      </w:r>
-      <w:r>
-        <w:rPr>
-          <w:rFonts w:ascii="Times New Roman" w:hAnsi="Times New Roman" w:cs="Times New Roman"/>
-          <w:sz w:val="24"/>
-          <w:szCs w:val="24"/>
-          <w:lang w:val="es-GT"/>
-        </w:rPr>
-        <w:t xml:space="preserve"> Ingresos generados por cada categoría de producto dentro de los pedidos completados.</w:t>
-      </w:r>
-    </w:p>
-    <w:p>
-      <w:pPr>
-        <w:spacing w:after="120"/>
-        <w:rPr>
-          <w:rFonts w:ascii="Times New Roman" w:hAnsi="Times New Roman" w:cs="Times New Roman"/>
-          <w:sz w:val="24"/>
-          <w:szCs w:val="24"/>
-          <w:lang w:val="es-GT"/>
-        </w:rPr>
-      </w:pPr>
-      <w:r>
+      </w:pPr>
+    </w:p>
+    <w:p>
+      <w:pPr>
+        <w:spacing w:after="120"/>
         <w:rPr>
           <w:rFonts w:ascii="Times New Roman" w:hAnsi="Times New Roman" w:cs="Times New Roman"/>
           <w:b/>
@@ -2083,29 +2116,11 @@
           <w:szCs w:val="24"/>
           <w:lang w:val="es-GT"/>
         </w:rPr>
-        <w:t>Importancia para el área:</w:t>
-      </w:r>
-      <w:r>
-        <w:rPr>
-          <w:rFonts w:ascii="Times New Roman" w:hAnsi="Times New Roman" w:cs="Times New Roman"/>
-          <w:sz w:val="24"/>
-          <w:szCs w:val="24"/>
-          <w:lang w:val="es-GT"/>
-        </w:rPr>
-        <w:t xml:space="preserve"> Permite identificar qué categorías generan más ingresos para la empresa. Esta información ayuda a priorizar inventario, promociones y estrategias comerciales según las categorías con mejor desempeño.</w:t>
-      </w:r>
-    </w:p>
-    <w:p>
-      <w:pPr>
-        <w:spacing w:after="120"/>
-        <w:rPr>
-          <w:rFonts w:ascii="Times New Roman" w:hAnsi="Times New Roman" w:cs="Times New Roman"/>
-          <w:sz w:val="24"/>
-          <w:szCs w:val="24"/>
-          <w:lang w:val="es-GT"/>
-        </w:rPr>
-      </w:pPr>
-      <w:r>
+      </w:pPr>
+    </w:p>
+    <w:p>
+      <w:pPr>
+        <w:spacing w:after="120"/>
         <w:rPr>
           <w:rFonts w:ascii="Times New Roman" w:hAnsi="Times New Roman" w:cs="Times New Roman"/>
           <w:b/>
@@ -2114,6 +2129,139 @@
           <w:szCs w:val="24"/>
           <w:lang w:val="es-GT"/>
         </w:rPr>
+      </w:pPr>
+    </w:p>
+    <w:p>
+      <w:pPr>
+        <w:spacing w:after="120"/>
+        <w:rPr>
+          <w:rFonts w:ascii="Times New Roman" w:hAnsi="Times New Roman" w:cs="Times New Roman"/>
+          <w:b/>
+          <w:bCs/>
+          <w:sz w:val="24"/>
+          <w:szCs w:val="24"/>
+          <w:lang w:val="es-GT"/>
+        </w:rPr>
+      </w:pPr>
+    </w:p>
+    <w:p>
+      <w:pPr>
+        <w:spacing w:after="120"/>
+        <w:rPr>
+          <w:rFonts w:ascii="Times New Roman" w:hAnsi="Times New Roman" w:cs="Times New Roman"/>
+          <w:b/>
+          <w:bCs/>
+          <w:sz w:val="24"/>
+          <w:szCs w:val="24"/>
+          <w:lang w:val="es-GT"/>
+        </w:rPr>
+      </w:pPr>
+    </w:p>
+    <w:p>
+      <w:pPr>
+        <w:spacing w:after="120"/>
+        <w:rPr>
+          <w:rFonts w:ascii="Times New Roman" w:hAnsi="Times New Roman" w:cs="Times New Roman"/>
+          <w:b/>
+          <w:bCs/>
+          <w:sz w:val="24"/>
+          <w:szCs w:val="24"/>
+          <w:lang w:val="es-GT"/>
+        </w:rPr>
+      </w:pPr>
+      <w:r>
+        <w:rPr>
+          <w:rFonts w:ascii="Times New Roman" w:hAnsi="Times New Roman" w:cs="Times New Roman"/>
+          <w:b/>
+          <w:bCs/>
+          <w:sz w:val="24"/>
+          <w:szCs w:val="24"/>
+          <w:lang w:val="es-GT"/>
+        </w:rPr>
+        <w:t>KPI 6 — Ventas por Categoría de Producto</w:t>
+      </w:r>
+    </w:p>
+    <w:p>
+      <w:pPr>
+        <w:spacing w:after="120"/>
+        <w:rPr>
+          <w:rFonts w:ascii="Times New Roman" w:hAnsi="Times New Roman" w:cs="Times New Roman"/>
+          <w:sz w:val="24"/>
+          <w:szCs w:val="24"/>
+          <w:lang w:val="es-GT"/>
+        </w:rPr>
+      </w:pPr>
+      <w:r>
+        <w:rPr>
+          <w:rFonts w:ascii="Times New Roman" w:hAnsi="Times New Roman" w:cs="Times New Roman"/>
+          <w:b/>
+          <w:bCs/>
+          <w:sz w:val="24"/>
+          <w:szCs w:val="24"/>
+          <w:lang w:val="es-GT"/>
+        </w:rPr>
+        <w:t>Qué representa:</w:t>
+      </w:r>
+      <w:r>
+        <w:rPr>
+          <w:rFonts w:ascii="Times New Roman" w:hAnsi="Times New Roman" w:cs="Times New Roman"/>
+          <w:sz w:val="24"/>
+          <w:szCs w:val="24"/>
+          <w:lang w:val="es-GT"/>
+        </w:rPr>
+        <w:t xml:space="preserve"> Ingresos generados por cada categoría de producto dentro de los pedidos completados.</w:t>
+      </w:r>
+    </w:p>
+    <w:p>
+      <w:pPr>
+        <w:spacing w:after="120"/>
+        <w:rPr>
+          <w:rFonts w:ascii="Times New Roman" w:hAnsi="Times New Roman" w:cs="Times New Roman"/>
+          <w:sz w:val="24"/>
+          <w:szCs w:val="24"/>
+          <w:lang w:val="es-GT"/>
+        </w:rPr>
+      </w:pPr>
+      <w:r>
+        <w:rPr>
+          <w:rFonts w:ascii="Times New Roman" w:hAnsi="Times New Roman" w:cs="Times New Roman"/>
+          <w:b/>
+          <w:bCs/>
+          <w:sz w:val="24"/>
+          <w:szCs w:val="24"/>
+          <w:lang w:val="es-GT"/>
+        </w:rPr>
+        <w:t>Importancia para el área:</w:t>
+      </w:r>
+      <w:r>
+        <w:rPr>
+          <w:rFonts w:ascii="Times New Roman" w:hAnsi="Times New Roman" w:cs="Times New Roman"/>
+          <w:sz w:val="24"/>
+          <w:szCs w:val="24"/>
+          <w:lang w:val="es-GT"/>
+        </w:rPr>
+        <w:t xml:space="preserve"> Permite identificar qué categorías generan más ingresos para la empresa. Esta información ayuda a priorizar inventario, promociones y estrategias comerciales según las categorías con mejor desempeño.</w:t>
+      </w:r>
+    </w:p>
+    <w:p>
+      <w:pPr>
+        <w:spacing w:after="120"/>
+        <w:rPr>
+          <w:rFonts w:ascii="Times New Roman" w:hAnsi="Times New Roman" w:cs="Times New Roman"/>
+          <w:sz w:val="24"/>
+          <w:szCs w:val="24"/>
+          <w:lang w:val="es-GT"/>
+        </w:rPr>
+      </w:pPr>
+      <w:r>
+        <w:rPr>
+          <w:rFonts w:ascii="Times New Roman" w:hAnsi="Times New Roman" w:cs="Times New Roman"/>
+          <w:b/>
+          <w:bCs/>
+          <w:sz w:val="24"/>
+          <w:szCs w:val="24"/>
+          <w:lang w:val="es-GT"/>
+        </w:rPr>
         <w:t>Visualización:</w:t>
       </w:r>
       <w:r>
@@ -2139,11 +2287,11 @@
       <w:r>
         <w:rPr>
           <w:rFonts w:ascii="Times New Roman" w:hAnsi="Times New Roman" w:cs="Times New Roman"/>
-          <w:sz w:val="24"/>
-          <w:szCs w:val="24"/>
-          <w:lang w:val="es-GT"/>
-        </w:rPr>
-        <w:lastRenderedPageBreak/>
+          <w:noProof/>
+          <w:sz w:val="24"/>
+          <w:szCs w:val="24"/>
+          <w:lang w:val="es-GT"/>
+        </w:rPr>
         <w:drawing>
           <wp:inline distT="0" distB="0" distL="0" distR="0" wp14:anchorId="7EDA3755" wp14:editId="4D41FE19">
             <wp:extent cx="5943600" cy="2489200"/>
@@ -2219,10 +2367,10 @@
           <w:lang w:val="es-GT"/>
         </w:rPr>
         <w:drawing>
-          <wp:inline distT="0" distB="0" distL="0" distR="0" wp14:anchorId="6669CAF9" wp14:editId="57B6F397">
-            <wp:extent cx="5943600" cy="1544320"/>
+          <wp:inline distT="0" distB="0" distL="0" distR="0" wp14:anchorId="61CA3036" wp14:editId="427B0378">
+            <wp:extent cx="5943600" cy="2023110"/>
             <wp:effectExtent l="0" t="0" r="0" b="0"/>
-            <wp:docPr id="1287273919" name="Imagen 1"/>
+            <wp:docPr id="1982936799" name="Imagen 1"/>
             <wp:cNvGraphicFramePr>
               <a:graphicFrameLocks xmlns:a="http://schemas.openxmlformats.org/drawingml/2006/main" noChangeAspect="1"/>
             </wp:cNvGraphicFramePr>
@@ -2230,7 +2378,7 @@
               <a:graphicData uri="http://schemas.openxmlformats.org/drawingml/2006/picture">
                 <pic:pic xmlns:pic="http://schemas.openxmlformats.org/drawingml/2006/picture">
                   <pic:nvPicPr>
-                    <pic:cNvPr id="1287273919" name=""/>
+                    <pic:cNvPr id="1982936799" name=""/>
                     <pic:cNvPicPr/>
                   </pic:nvPicPr>
                   <pic:blipFill>
@@ -2242,7 +2390,7 @@
                   <pic:spPr>
                     <a:xfrm>
                       <a:off x="0" y="0"/>
-                      <a:ext cx="5943600" cy="1544320"/>
+                      <a:ext cx="5943600" cy="2023110"/>
                     </a:xfrm>
                     <a:prstGeom prst="rect">
                       <a:avLst/>
@@ -2265,6 +2413,61 @@
           <w:lang w:val="es-GT"/>
         </w:rPr>
       </w:pPr>
+    </w:p>
+    <w:p>
+      <w:pPr>
+        <w:pStyle w:val="Ttulo2"/>
+        <w:rPr>
+          <w:rFonts w:ascii="Times New Roman" w:hAnsi="Times New Roman" w:cs="Times New Roman"/>
+          <w:sz w:val="24"/>
+          <w:szCs w:val="24"/>
+          <w:lang w:val="es-GT"/>
+        </w:rPr>
+      </w:pPr>
+    </w:p>
+    <w:p>
+      <w:pPr>
+        <w:pStyle w:val="Ttulo2"/>
+        <w:rPr>
+          <w:rFonts w:ascii="Times New Roman" w:hAnsi="Times New Roman" w:cs="Times New Roman"/>
+          <w:sz w:val="24"/>
+          <w:szCs w:val="24"/>
+          <w:lang w:val="es-GT"/>
+        </w:rPr>
+      </w:pPr>
+    </w:p>
+    <w:p>
+      <w:pPr>
+        <w:pStyle w:val="Ttulo2"/>
+        <w:rPr>
+          <w:rFonts w:ascii="Times New Roman" w:hAnsi="Times New Roman" w:cs="Times New Roman"/>
+          <w:sz w:val="24"/>
+          <w:szCs w:val="24"/>
+          <w:lang w:val="es-GT"/>
+        </w:rPr>
+      </w:pPr>
+    </w:p>
+    <w:p>
+      <w:pPr>
+        <w:pStyle w:val="Ttulo2"/>
+        <w:rPr>
+          <w:rFonts w:ascii="Times New Roman" w:hAnsi="Times New Roman" w:cs="Times New Roman"/>
+          <w:sz w:val="24"/>
+          <w:szCs w:val="24"/>
+          <w:lang w:val="es-GT"/>
+        </w:rPr>
+      </w:pPr>
+    </w:p>
+    <w:p>
+      <w:pPr>
+        <w:pStyle w:val="Ttulo2"/>
+        <w:rPr>
+          <w:rFonts w:ascii="Times New Roman" w:hAnsi="Times New Roman" w:cs="Times New Roman"/>
+          <w:sz w:val="24"/>
+          <w:szCs w:val="24"/>
+          <w:lang w:val="es-GT"/>
+        </w:rPr>
+      </w:pPr>
       <w:r>
         <w:rPr>
           <w:rFonts w:ascii="Times New Roman" w:hAnsi="Times New Roman" w:cs="Times New Roman"/>
@@ -2426,13 +2629,17 @@
       </w:pPr>
       <w:r>
         <w:rPr>
+          <w:rFonts w:ascii="Times New Roman" w:hAnsi="Times New Roman" w:cs="Times New Roman"/>
           <w:noProof/>
+          <w:sz w:val="24"/>
+          <w:szCs w:val="24"/>
+          <w:lang w:val="es-GT"/>
         </w:rPr>
         <w:drawing>
-          <wp:inline distT="0" distB="0" distL="0" distR="0" wp14:anchorId="505CB710" wp14:editId="48EE3444">
-            <wp:extent cx="5943600" cy="1415415"/>
-            <wp:effectExtent l="0" t="0" r="0" b="0"/>
-            <wp:docPr id="1578263387" name="Picture 4" descr="KPI 7 - Kpi7-clientes-mes"/>
+          <wp:inline distT="0" distB="0" distL="0" distR="0" wp14:anchorId="43E73DAA" wp14:editId="688F744C">
+            <wp:extent cx="6102765" cy="2029691"/>
+            <wp:effectExtent l="0" t="0" r="0" b="8890"/>
+            <wp:docPr id="1195045288" name="Imagen 1"/>
             <wp:cNvGraphicFramePr>
               <a:graphicFrameLocks xmlns:a="http://schemas.openxmlformats.org/drawingml/2006/main" noChangeAspect="1"/>
             </wp:cNvGraphicFramePr>
@@ -2440,36 +2647,23 @@
               <a:graphicData uri="http://schemas.openxmlformats.org/drawingml/2006/picture">
                 <pic:pic xmlns:pic="http://schemas.openxmlformats.org/drawingml/2006/picture">
                   <pic:nvPicPr>
-                    <pic:cNvPr id="0" name="Picture 7" descr="KPI 7 - Kpi7-clientes-mes"/>
-                    <pic:cNvPicPr>
-                      <a:picLocks noChangeAspect="1" noChangeArrowheads="1"/>
-                    </pic:cNvPicPr>
+                    <pic:cNvPr id="1195045288" name=""/>
+                    <pic:cNvPicPr/>
                   </pic:nvPicPr>
                   <pic:blipFill>
-                    <a:blip r:embed="rId20">
-                      <a:extLst>
-                        <a:ext uri="{28A0092B-C50C-407E-A947-70E740481C1C}">
-                          <a14:useLocalDpi xmlns:a14="http://schemas.microsoft.com/office/drawing/2010/main" val="0"/>
-                        </a:ext>
-                      </a:extLst>
-                    </a:blip>
-                    <a:srcRect/>
+                    <a:blip r:embed="rId20"/>
                     <a:stretch>
                       <a:fillRect/>
                     </a:stretch>
                   </pic:blipFill>
-                  <pic:spPr bwMode="auto">
+                  <pic:spPr>
                     <a:xfrm>
                       <a:off x="0" y="0"/>
-                      <a:ext cx="5943600" cy="1415415"/>
+                      <a:ext cx="6109841" cy="2032044"/>
                     </a:xfrm>
                     <a:prstGeom prst="rect">
                       <a:avLst/>
                     </a:prstGeom>
-                    <a:noFill/>
-                    <a:ln>
-                      <a:noFill/>
-                    </a:ln>
                   </pic:spPr>
                 </pic:pic>
               </a:graphicData>
@@ -2495,29 +2689,30 @@
           <w:szCs w:val="24"/>
           <w:lang w:val="es-GT"/>
         </w:rPr>
-        <w:lastRenderedPageBreak/>
         <w:t>Consulta SQL:</w:t>
       </w:r>
     </w:p>
     <w:p>
       <w:pPr>
         <w:pStyle w:val="Ttulo3"/>
-        <w:rPr>
-          <w:rFonts w:ascii="Times New Roman" w:hAnsi="Times New Roman" w:cs="Times New Roman"/>
-          <w:lang w:val="es-GT"/>
-        </w:rPr>
-      </w:pPr>
-      <w:r>
+        <w:jc w:val="center"/>
         <w:rPr>
           <w:rFonts w:ascii="Times New Roman" w:hAnsi="Times New Roman" w:cs="Times New Roman"/>
           <w:noProof/>
           <w:lang w:val="es-GT"/>
         </w:rPr>
+      </w:pPr>
+      <w:r>
+        <w:rPr>
+          <w:rFonts w:ascii="Times New Roman" w:hAnsi="Times New Roman" w:cs="Times New Roman"/>
+          <w:noProof/>
+          <w:lang w:val="es-GT"/>
+        </w:rPr>
         <w:drawing>
-          <wp:inline distT="0" distB="0" distL="0" distR="0" wp14:anchorId="238B9F18" wp14:editId="3E6310FE">
-            <wp:extent cx="5363323" cy="1905266"/>
-            <wp:effectExtent l="0" t="0" r="0" b="0"/>
-            <wp:docPr id="1816855446" name="Picture 1"/>
+          <wp:inline distT="0" distB="0" distL="0" distR="0" wp14:anchorId="2A477E4F" wp14:editId="13C56635">
+            <wp:extent cx="4732430" cy="1615580"/>
+            <wp:effectExtent l="0" t="0" r="0" b="3810"/>
+            <wp:docPr id="758293825" name="Imagen 1"/>
             <wp:cNvGraphicFramePr>
               <a:graphicFrameLocks xmlns:a="http://schemas.openxmlformats.org/drawingml/2006/main" noChangeAspect="1"/>
             </wp:cNvGraphicFramePr>
@@ -2525,7 +2720,7 @@
               <a:graphicData uri="http://schemas.openxmlformats.org/drawingml/2006/picture">
                 <pic:pic xmlns:pic="http://schemas.openxmlformats.org/drawingml/2006/picture">
                   <pic:nvPicPr>
-                    <pic:cNvPr id="1816855446" name=""/>
+                    <pic:cNvPr id="758293825" name=""/>
                     <pic:cNvPicPr/>
                   </pic:nvPicPr>
                   <pic:blipFill>
@@ -2537,7 +2732,7 @@
                   <pic:spPr>
                     <a:xfrm>
                       <a:off x="0" y="0"/>
-                      <a:ext cx="5363323" cy="1905266"/>
+                      <a:ext cx="4732430" cy="1615580"/>
                     </a:xfrm>
                     <a:prstGeom prst="rect">
                       <a:avLst/>
@@ -2555,6 +2750,7 @@
         <w:pStyle w:val="Ttulo3"/>
         <w:rPr>
           <w:rFonts w:ascii="Times New Roman" w:hAnsi="Times New Roman" w:cs="Times New Roman"/>
+          <w:noProof/>
           <w:lang w:val="es-GT"/>
         </w:rPr>
       </w:pPr>
@@ -2564,15 +2760,7 @@
         <w:pStyle w:val="Ttulo3"/>
         <w:rPr>
           <w:rFonts w:ascii="Times New Roman" w:hAnsi="Times New Roman" w:cs="Times New Roman"/>
-          <w:lang w:val="es-GT"/>
-        </w:rPr>
-      </w:pPr>
-    </w:p>
-    <w:p>
-      <w:pPr>
-        <w:pStyle w:val="Ttulo3"/>
-        <w:rPr>
-          <w:rFonts w:ascii="Times New Roman" w:hAnsi="Times New Roman" w:cs="Times New Roman"/>
+          <w:noProof/>
           <w:lang w:val="es-GT"/>
         </w:rPr>
       </w:pPr>
@@ -2819,7 +3007,6 @@
           <w:sz w:val="24"/>
           <w:szCs w:val="24"/>
         </w:rPr>
-        <w:lastRenderedPageBreak/>
         <w:drawing>
           <wp:inline distT="0" distB="0" distL="0" distR="0" wp14:anchorId="63A0D835" wp14:editId="2C936470">
             <wp:extent cx="5553850" cy="2438740"/>
@@ -2886,7 +3073,6 @@
           <w:rFonts w:ascii="Times New Roman" w:hAnsi="Times New Roman" w:cs="Times New Roman"/>
           <w:lang w:val="es-GT"/>
         </w:rPr>
-        <w:lastRenderedPageBreak/>
         <w:t>KPI 3 — ARPU Mensual por Segmento</w:t>
       </w:r>
     </w:p>
@@ -2998,7 +3184,7 @@
           <w:noProof/>
         </w:rPr>
         <w:drawing>
-          <wp:inline distT="0" distB="0" distL="0" distR="0" wp14:anchorId="43675FBF" wp14:editId="06DFFBE0">
+          <wp:inline distT="0" distB="0" distL="0" distR="0" wp14:anchorId="43675FBF" wp14:editId="188434EC">
             <wp:extent cx="5943600" cy="1988820"/>
             <wp:effectExtent l="0" t="0" r="0" b="0"/>
             <wp:docPr id="1164681302" name="Picture 7" descr="KPI 9 - ARPU mensual por segmento"/>
@@ -3146,7 +3332,6 @@
           <w:rFonts w:ascii="Times New Roman" w:hAnsi="Times New Roman" w:cs="Times New Roman"/>
           <w:lang w:val="es-GT"/>
         </w:rPr>
-        <w:lastRenderedPageBreak/>
         <w:t xml:space="preserve">KPI 4 — </w:t>
       </w:r>
       <w:proofErr w:type="gramStart"/>
@@ -3294,9 +3479,9 @@
           <w:noProof/>
         </w:rPr>
         <w:drawing>
-          <wp:inline distT="0" distB="0" distL="0" distR="0" wp14:anchorId="0156020A" wp14:editId="4F262ED8">
-            <wp:extent cx="5943600" cy="3331210"/>
-            <wp:effectExtent l="0" t="0" r="0" b="2540"/>
+          <wp:inline distT="0" distB="0" distL="0" distR="0" wp14:anchorId="0156020A" wp14:editId="6274ED5F">
+            <wp:extent cx="5943600" cy="2957830"/>
+            <wp:effectExtent l="0" t="0" r="0" b="0"/>
             <wp:docPr id="1643758376" name="Picture 8" descr="KPI 4 - Ticket Promedio por Segmento"/>
             <wp:cNvGraphicFramePr>
               <a:graphicFrameLocks xmlns:a="http://schemas.openxmlformats.org/drawingml/2006/main" noChangeAspect="1"/>
@@ -3310,7 +3495,7 @@
                       <a:picLocks noChangeAspect="1" noChangeArrowheads="1"/>
                     </pic:cNvPicPr>
                   </pic:nvPicPr>
-                  <pic:blipFill>
+                  <pic:blipFill rotWithShape="1">
                     <a:blip r:embed="rId26" cstate="print">
                       <a:extLst>
                         <a:ext uri="{28A0092B-C50C-407E-A947-70E740481C1C}">
@@ -3318,7 +3503,7 @@
                         </a:ext>
                       </a:extLst>
                     </a:blip>
-                    <a:srcRect/>
+                    <a:srcRect t="11209"/>
                     <a:stretch>
                       <a:fillRect/>
                     </a:stretch>
@@ -3326,7 +3511,7 @@
                   <pic:spPr bwMode="auto">
                     <a:xfrm>
                       <a:off x="0" y="0"/>
-                      <a:ext cx="5943600" cy="3331210"/>
+                      <a:ext cx="5943600" cy="2957830"/>
                     </a:xfrm>
                     <a:prstGeom prst="rect">
                       <a:avLst/>
@@ -3335,6 +3520,11 @@
                     <a:ln>
                       <a:noFill/>
                     </a:ln>
+                    <a:extLst>
+                      <a:ext uri="{53640926-AAD7-44D8-BBD7-CCE9431645EC}">
+                        <a14:shadowObscured xmlns:a14="http://schemas.microsoft.com/office/drawing/2010/main"/>
+                      </a:ext>
+                    </a:extLst>
                   </pic:spPr>
                 </pic:pic>
               </a:graphicData>
@@ -3432,12 +3622,29 @@
           <w:lang w:val="es-GT"/>
         </w:rPr>
       </w:pPr>
-      <w:r>
-        <w:rPr>
-          <w:rFonts w:ascii="Times New Roman" w:hAnsi="Times New Roman" w:cs="Times New Roman"/>
-          <w:lang w:val="es-GT"/>
-        </w:rPr>
-        <w:lastRenderedPageBreak/>
+    </w:p>
+    <w:p>
+      <w:pPr>
+        <w:pStyle w:val="Ttulo3"/>
+        <w:rPr>
+          <w:rFonts w:ascii="Times New Roman" w:hAnsi="Times New Roman" w:cs="Times New Roman"/>
+          <w:lang w:val="es-GT"/>
+        </w:rPr>
+      </w:pPr>
+    </w:p>
+    <w:p>
+      <w:pPr>
+        <w:pStyle w:val="Ttulo3"/>
+        <w:rPr>
+          <w:rFonts w:ascii="Times New Roman" w:hAnsi="Times New Roman" w:cs="Times New Roman"/>
+          <w:lang w:val="es-GT"/>
+        </w:rPr>
+      </w:pPr>
+      <w:r>
+        <w:rPr>
+          <w:rFonts w:ascii="Times New Roman" w:hAnsi="Times New Roman" w:cs="Times New Roman"/>
+          <w:lang w:val="es-GT"/>
+        </w:rPr>
         <w:t>KPI 5 — Tendencia de Ventas Mensual con Crecimiento MoM</w:t>
       </w:r>
     </w:p>
@@ -3610,8 +3817,8 @@
           <w:noProof/>
         </w:rPr>
         <w:drawing>
-          <wp:inline distT="0" distB="0" distL="0" distR="0" wp14:anchorId="2939FBE1" wp14:editId="190425AD">
-            <wp:extent cx="5356860" cy="3010372"/>
+          <wp:inline distT="0" distB="0" distL="0" distR="0" wp14:anchorId="2939FBE1" wp14:editId="642BB701">
+            <wp:extent cx="5356021" cy="2674620"/>
             <wp:effectExtent l="0" t="0" r="0" b="0"/>
             <wp:docPr id="761999785" name="Picture 9" descr="KPI 5 - Tendencia MoM"/>
             <wp:cNvGraphicFramePr>
@@ -3626,7 +3833,7 @@
                       <a:picLocks noChangeAspect="1" noChangeArrowheads="1"/>
                     </pic:cNvPicPr>
                   </pic:nvPicPr>
-                  <pic:blipFill>
+                  <pic:blipFill rotWithShape="1">
                     <a:blip r:embed="rId28" cstate="print">
                       <a:extLst>
                         <a:ext uri="{28A0092B-C50C-407E-A947-70E740481C1C}">
@@ -3634,7 +3841,7 @@
                         </a:ext>
                       </a:extLst>
                     </a:blip>
-                    <a:srcRect/>
+                    <a:srcRect t="11140"/>
                     <a:stretch>
                       <a:fillRect/>
                     </a:stretch>
@@ -3642,7 +3849,7 @@
                   <pic:spPr bwMode="auto">
                     <a:xfrm>
                       <a:off x="0" y="0"/>
-                      <a:ext cx="5362263" cy="3013408"/>
+                      <a:ext cx="5362263" cy="2677737"/>
                     </a:xfrm>
                     <a:prstGeom prst="rect">
                       <a:avLst/>
@@ -3651,6 +3858,11 @@
                     <a:ln>
                       <a:noFill/>
                     </a:ln>
+                    <a:extLst>
+                      <a:ext uri="{53640926-AAD7-44D8-BBD7-CCE9431645EC}">
+                        <a14:shadowObscured xmlns:a14="http://schemas.microsoft.com/office/drawing/2010/main"/>
+                      </a:ext>
+                    </a:extLst>
                   </pic:spPr>
                 </pic:pic>
               </a:graphicData>
@@ -3741,12 +3953,20 @@
           <w:lang w:val="es-GT"/>
         </w:rPr>
       </w:pPr>
-      <w:r>
-        <w:rPr>
-          <w:rFonts w:ascii="Times New Roman" w:hAnsi="Times New Roman" w:cs="Times New Roman"/>
-          <w:lang w:val="es-GT"/>
-        </w:rPr>
-        <w:lastRenderedPageBreak/>
+    </w:p>
+    <w:p>
+      <w:pPr>
+        <w:pStyle w:val="Ttulo3"/>
+        <w:rPr>
+          <w:rFonts w:ascii="Times New Roman" w:hAnsi="Times New Roman" w:cs="Times New Roman"/>
+          <w:lang w:val="es-GT"/>
+        </w:rPr>
+      </w:pPr>
+      <w:r>
+        <w:rPr>
+          <w:rFonts w:ascii="Times New Roman" w:hAnsi="Times New Roman" w:cs="Times New Roman"/>
+          <w:lang w:val="es-GT"/>
+        </w:rPr>
         <w:t>KPI 6 — Participación de Ingresos por Canal de Venta</w:t>
       </w:r>
     </w:p>
@@ -3858,9 +4078,9 @@
           <w:noProof/>
         </w:rPr>
         <w:drawing>
-          <wp:inline distT="0" distB="0" distL="0" distR="0" wp14:anchorId="4795C9B5" wp14:editId="56BFD967">
-            <wp:extent cx="5943600" cy="3340100"/>
-            <wp:effectExtent l="0" t="0" r="0" b="0"/>
+          <wp:inline distT="0" distB="0" distL="0" distR="0" wp14:anchorId="4795C9B5" wp14:editId="12136BD6">
+            <wp:extent cx="5943600" cy="2966720"/>
+            <wp:effectExtent l="0" t="0" r="0" b="5080"/>
             <wp:docPr id="394806862" name="Picture 10" descr="KPI 6 - Participación por Canal"/>
             <wp:cNvGraphicFramePr>
               <a:graphicFrameLocks xmlns:a="http://schemas.openxmlformats.org/drawingml/2006/main" noChangeAspect="1"/>
@@ -3874,7 +4094,7 @@
                       <a:picLocks noChangeAspect="1" noChangeArrowheads="1"/>
                     </pic:cNvPicPr>
                   </pic:nvPicPr>
-                  <pic:blipFill>
+                  <pic:blipFill rotWithShape="1">
                     <a:blip r:embed="rId30" cstate="print">
                       <a:extLst>
                         <a:ext uri="{28A0092B-C50C-407E-A947-70E740481C1C}">
@@ -3882,7 +4102,7 @@
                         </a:ext>
                       </a:extLst>
                     </a:blip>
-                    <a:srcRect/>
+                    <a:srcRect t="11179"/>
                     <a:stretch>
                       <a:fillRect/>
                     </a:stretch>
@@ -3890,7 +4110,7 @@
                   <pic:spPr bwMode="auto">
                     <a:xfrm>
                       <a:off x="0" y="0"/>
-                      <a:ext cx="5943600" cy="3340100"/>
+                      <a:ext cx="5943600" cy="2966720"/>
                     </a:xfrm>
                     <a:prstGeom prst="rect">
                       <a:avLst/>
@@ -3899,6 +4119,11 @@
                     <a:ln>
                       <a:noFill/>
                     </a:ln>
+                    <a:extLst>
+                      <a:ext uri="{53640926-AAD7-44D8-BBD7-CCE9431645EC}">
+                        <a14:shadowObscured xmlns:a14="http://schemas.microsoft.com/office/drawing/2010/main"/>
+                      </a:ext>
+                    </a:extLst>
                   </pic:spPr>
                 </pic:pic>
               </a:graphicData>
@@ -4610,6 +4835,7 @@
   <w:style w:type="character" w:default="1" w:styleId="Fuentedeprrafopredeter">
     <w:name w:val="Default Paragraph Font"/>
     <w:uiPriority w:val="1"/>
+    <w:semiHidden/>
     <w:unhideWhenUsed/>
   </w:style>
   <w:style w:type="table" w:default="1" w:styleId="Tablanormal">

</xml_diff>